<commit_message>
Fill Mayfair GST non-registration declaration and update checklist
Co-Authored-By: Claude Opus 5.5 <noreply@anthropic.com>
Claude-Session: https://claude.ai/code/session_01UbJaKorh4mZTkXzSUC4k7b
</commit_message>
<xml_diff>
--- a/Mayfair Docs/Filled - Joes Jyoti Services/Checklist and Reply - Joes Jyoti Services.docx
+++ b/Mayfair Docs/Filled - Joes Jyoti Services/Checklist and Reply - Joes Jyoti Services.docx
@@ -924,27 +924,21 @@
             <w:tcW w:type="dxa" w:w="4422"/>
           </w:tcPr>
           <w:p>
-            <w:pPr>
-              <w:spacing w:after="20"/>
-            </w:pPr>
             <w:r/>
             <w:r>
               <w:rPr>
                 <w:b w:val="0"/>
               </w:rPr>
-              <w:t xml:space="preserve">Registered, so the “not registered” declaration is </w:t>
+              <w:t xml:space="preserve">Form filled as asked. </w:t>
             </w:r>
             <w:r>
               <w:rPr>
                 <w:b/>
               </w:rPr>
-              <w:t>not needed</w:t>
+              <w:t xml:space="preserve">⚠ Do not sign or send it while GSTIN 21AAECJ4555G1ZT is active. </w:t>
             </w:r>
             <w:r>
-              <w:rPr>
-                <w:b w:val="0"/>
-              </w:rPr>
-              <w:t xml:space="preserve"> (GST Declaration - Format.docx left unused).</w:t>
+              <w:t>It declares the company is not required to register for GST, which contradicts the GST certificate. Send the GST certificate instead, unless the registration has been cancelled.</w:t>
             </w:r>
           </w:p>
         </w:tc>
@@ -953,15 +947,9 @@
             <w:tcW w:type="dxa" w:w="2835"/>
           </w:tcPr>
           <w:p>
-            <w:pPr>
-              <w:spacing w:after="20"/>
-            </w:pPr>
             <w:r/>
             <w:r>
-              <w:rPr>
-                <w:b w:val="0"/>
-              </w:rPr>
-              <w:t>IMG_20210406_0001.pdf (GST REG-06) + IMG_20210406_0003.pdf (Annexure B)</w:t>
+              <w:t>IMG_20210406_0001.pdf (GST REG-06) + IMG_20210406_0003.pdf (Annexure B). Only if GST is cancelled: GST Declaration (Not Registered) - Joes Jyoti Services.docx</w:t>
             </w:r>
           </w:p>
         </w:tc>

</xml_diff>

<commit_message>
Add cancelled cheque and fill bank details in Mayfair vendor form
Fill bank name, account number, IFSC and bank address from the Axis Bank
cancelled cheque, tick Current Account, and update the checklist.

Co-Authored-By: Claude Opus 5.5 <noreply@anthropic.com>
Claude-Session: https://claude.ai/code/session_01UbJaKorh4mZTkXzSUC4k7b
</commit_message>
<xml_diff>
--- a/Mayfair Docs/Filled - Joes Jyoti Services/Checklist and Reply - Joes Jyoti Services.docx
+++ b/Mayfair Docs/Filled - Joes Jyoti Services/Checklist and Reply - Joes Jyoti Services.docx
@@ -635,6 +635,94 @@
           </w:p>
         </w:tc>
       </w:tr>
+      <w:tr>
+        <w:tc>
+          <w:tcPr>
+            <w:tcW w:type="dxa" w:w="1984"/>
+          </w:tcPr>
+          <w:p>
+            <w:r/>
+            <w:r>
+              <w:rPr>
+                <w:b w:val="0"/>
+              </w:rPr>
+              <w:t>Bank account</w:t>
+            </w:r>
+          </w:p>
+        </w:tc>
+        <w:tc>
+          <w:tcPr>
+            <w:tcW w:type="dxa" w:w="3969"/>
+          </w:tcPr>
+          <w:p>
+            <w:r/>
+            <w:r>
+              <w:rPr>
+                <w:b w:val="0"/>
+              </w:rPr>
+              <w:t>Axis Bank Ltd, A/c No. 919020019694374 (CANOR), IFSC UTIB0000381, MICR 751211003</w:t>
+            </w:r>
+          </w:p>
+        </w:tc>
+        <w:tc>
+          <w:tcPr>
+            <w:tcW w:type="dxa" w:w="3685"/>
+          </w:tcPr>
+          <w:p>
+            <w:r/>
+            <w:r>
+              <w:rPr>
+                <w:b w:val="0"/>
+              </w:rPr>
+              <w:t>Cancelled cheque (Cancelled Cheque - Axis Bank.jpg)</w:t>
+            </w:r>
+          </w:p>
+        </w:tc>
+      </w:tr>
+      <w:tr>
+        <w:tc>
+          <w:tcPr>
+            <w:tcW w:type="dxa" w:w="1984"/>
+          </w:tcPr>
+          <w:p>
+            <w:r/>
+            <w:r>
+              <w:rPr>
+                <w:b w:val="0"/>
+              </w:rPr>
+              <w:t>Bank branch</w:t>
+            </w:r>
+          </w:p>
+        </w:tc>
+        <w:tc>
+          <w:tcPr>
+            <w:tcW w:type="dxa" w:w="3969"/>
+          </w:tcPr>
+          <w:p>
+            <w:r/>
+            <w:r>
+              <w:rPr>
+                <w:b w:val="0"/>
+              </w:rPr>
+              <w:t>Chandrasekharpur, Bhubaneswar – 751016</w:t>
+            </w:r>
+          </w:p>
+        </w:tc>
+        <w:tc>
+          <w:tcPr>
+            <w:tcW w:type="dxa" w:w="3685"/>
+          </w:tcPr>
+          <w:p>
+            <w:r/>
+            <w:r>
+              <w:rPr>
+                <w:b w:val="0"/>
+              </w:rPr>
+              <w:t>Cancelled cheque</w:t>
+            </w:r>
+          </w:p>
+        </w:tc>
+      </w:tr>
     </w:tbl>
     <w:p/>
     <w:p>
@@ -778,21 +866,18 @@
             <w:tcW w:type="dxa" w:w="4422"/>
           </w:tcPr>
           <w:p>
-            <w:pPr>
-              <w:spacing w:after="20"/>
-            </w:pPr>
             <w:r/>
             <w:r>
               <w:rPr>
                 <w:b w:val="0"/>
               </w:rPr>
-              <w:t xml:space="preserve">Filled in. </w:t>
+              <w:t xml:space="preserve">Filled in, including bank details from the cancelled cheque (Current Account ticked, based on the account code "CANOR" printed on the cheque). </w:t>
             </w:r>
             <w:r>
               <w:rPr>
                 <w:b/>
               </w:rPr>
-              <w:t>Phone, bank details, ESIC, MSME no., payment/delivery terms, account type and E-invoice are still blank.</w:t>
+              <w:t>Phone, ESIC, MSME no., payment/delivery terms and E-invoice are still blank.</w:t>
             </w:r>
           </w:p>
         </w:tc>
@@ -1228,21 +1313,12 @@
             <w:tcW w:type="dxa" w:w="4422"/>
           </w:tcPr>
           <w:p>
-            <w:pPr>
-              <w:spacing w:after="20"/>
-            </w:pPr>
             <w:r/>
-            <w:r>
-              <w:rPr>
-                <w:b/>
-              </w:rPr>
-              <w:t>Missing.</w:t>
-            </w:r>
             <w:r>
               <w:rPr>
                 <w:b w:val="0"/>
               </w:rPr>
-              <w:t xml:space="preserve"> Not in the repo.</w:t>
+              <w:t>Available. Axis Bank, Chandrasekharpur branch, stamped and signed by Esther Digal, Director.</w:t>
             </w:r>
           </w:p>
         </w:tc>
@@ -1251,15 +1327,12 @@
             <w:tcW w:type="dxa" w:w="2835"/>
           </w:tcPr>
           <w:p>
-            <w:pPr>
-              <w:spacing w:after="20"/>
-            </w:pPr>
             <w:r/>
             <w:r>
               <w:rPr>
                 <w:b w:val="0"/>
               </w:rPr>
-              <w:t>–</w:t>
+              <w:t>Cancelled Cheque - Axis Bank.jpg</w:t>
             </w:r>
           </w:p>
         </w:tc>
@@ -1434,23 +1507,6 @@
         <w:rPr>
           <w:b/>
         </w:rPr>
-        <w:t>Cancelled cheque</w:t>
-      </w:r>
-      <w:r>
-        <w:rPr>
-          <w:b w:val="0"/>
-        </w:rPr>
-        <w:t xml:space="preserve"> and the bank details that go on it: bank name, account number, account type (Current / Cash Credit / Other), IFSC and bank address. These go in rows 32–36 of the form.</w:t>
-      </w:r>
-    </w:p>
-    <w:p>
-      <w:pPr>
-        <w:pStyle w:val="ListNumber"/>
-      </w:pPr>
-      <w:r>
-        <w:rPr>
-          <w:b/>
-        </w:rPr>
         <w:t>Renewed FSSAI licence.</w:t>
       </w:r>
       <w:r>
@@ -1556,9 +1612,6 @@
         <w:t>Confirm the signatory.</w:t>
       </w:r>
       <w:r>
-        <w:rPr>
-          <w:b w:val="0"/>
-        </w:rPr>
         <w:t xml:space="preserve"> All declarations name </w:t>
       </w:r>
       <w:r>
@@ -1568,10 +1621,7 @@
         <w:t>Esther Digal, Director</w:t>
       </w:r>
       <w:r>
-        <w:rPr>
-          <w:b w:val="0"/>
-        </w:rPr>
-        <w:t>, the only director on the GST record. Change this if someone else signs.</w:t>
+        <w:t>. She is the only director on the GST record and signs the cancelled cheque as Director. Change this if someone else signs.</w:t>
       </w:r>
     </w:p>
     <w:p>

</xml_diff>

<commit_message>
Add renewed FSSAI licence and Udyam certificate, update vendor pack
Fill MSME/Udyam details in the vendor form, drop the MSME non-registration
declaration since the company is Udyam registered, and update the checklist
for the renewed FSSAI licence.

Co-Authored-By: Claude Opus 5.5 <noreply@anthropic.com>
Claude-Session: https://claude.ai/code/session_01UbJaKorh4mZTkXzSUC4k7b
</commit_message>
<xml_diff>
--- a/Mayfair Docs/Filled - Joes Jyoti Services/Checklist and Reply - Joes Jyoti Services.docx
+++ b/Mayfair Docs/Filled - Joes Jyoti Services/Checklist and Reply - Joes Jyoti Services.docx
@@ -49,14 +49,13 @@
         </w:trPr>
         <w:tc>
           <w:tcPr>
-            <w:tcW w:type="dxa" w:w="1984"/>
+            <w:tcW w:type="dxa" w:w="1871"/>
             <w:shd w:val="clear" w:color="auto" w:fill="1F3A5F"/>
           </w:tcPr>
           <w:p>
             <w:pPr>
               <w:spacing w:after="20"/>
             </w:pPr>
-            <w:r/>
             <w:r>
               <w:rPr>
                 <w:b/>
@@ -68,14 +67,13 @@
         </w:tc>
         <w:tc>
           <w:tcPr>
-            <w:tcW w:type="dxa" w:w="3969"/>
+            <w:tcW w:type="dxa" w:w="4252"/>
             <w:shd w:val="clear" w:color="auto" w:fill="1F3A5F"/>
           </w:tcPr>
           <w:p>
             <w:pPr>
               <w:spacing w:after="20"/>
             </w:pPr>
-            <w:r/>
             <w:r>
               <w:rPr>
                 <w:b/>
@@ -87,14 +85,13 @@
         </w:tc>
         <w:tc>
           <w:tcPr>
-            <w:tcW w:type="dxa" w:w="3685"/>
+            <w:tcW w:type="dxa" w:w="3515"/>
             <w:shd w:val="clear" w:color="auto" w:fill="1F3A5F"/>
           </w:tcPr>
           <w:p>
             <w:pPr>
               <w:spacing w:after="20"/>
             </w:pPr>
-            <w:r/>
             <w:r>
               <w:rPr>
                 <w:b/>
@@ -108,13 +105,12 @@
       <w:tr>
         <w:tc>
           <w:tcPr>
-            <w:tcW w:type="dxa" w:w="1984"/>
+            <w:tcW w:type="dxa" w:w="1871"/>
           </w:tcPr>
           <w:p>
             <w:pPr>
               <w:spacing w:after="20"/>
             </w:pPr>
-            <w:r/>
             <w:r>
               <w:rPr>
                 <w:b w:val="0"/>
@@ -125,13 +121,12 @@
         </w:tc>
         <w:tc>
           <w:tcPr>
-            <w:tcW w:type="dxa" w:w="3969"/>
+            <w:tcW w:type="dxa" w:w="4252"/>
           </w:tcPr>
           <w:p>
             <w:pPr>
               <w:spacing w:after="20"/>
             </w:pPr>
-            <w:r/>
             <w:r>
               <w:rPr>
                 <w:b w:val="0"/>
@@ -142,13 +137,12 @@
         </w:tc>
         <w:tc>
           <w:tcPr>
-            <w:tcW w:type="dxa" w:w="3685"/>
+            <w:tcW w:type="dxa" w:w="3515"/>
           </w:tcPr>
           <w:p>
             <w:pPr>
               <w:spacing w:after="20"/>
             </w:pPr>
-            <w:r/>
             <w:r>
               <w:rPr>
                 <w:b w:val="0"/>
@@ -161,13 +155,12 @@
       <w:tr>
         <w:tc>
           <w:tcPr>
-            <w:tcW w:type="dxa" w:w="1984"/>
+            <w:tcW w:type="dxa" w:w="1871"/>
           </w:tcPr>
           <w:p>
             <w:pPr>
               <w:spacing w:after="20"/>
             </w:pPr>
-            <w:r/>
             <w:r>
               <w:rPr>
                 <w:b w:val="0"/>
@@ -178,13 +171,12 @@
         </w:tc>
         <w:tc>
           <w:tcPr>
-            <w:tcW w:type="dxa" w:w="3969"/>
+            <w:tcW w:type="dxa" w:w="4252"/>
           </w:tcPr>
           <w:p>
             <w:pPr>
               <w:spacing w:after="20"/>
             </w:pPr>
-            <w:r/>
             <w:r>
               <w:rPr>
                 <w:b w:val="0"/>
@@ -195,13 +187,12 @@
         </w:tc>
         <w:tc>
           <w:tcPr>
-            <w:tcW w:type="dxa" w:w="3685"/>
+            <w:tcW w:type="dxa" w:w="3515"/>
           </w:tcPr>
           <w:p>
             <w:pPr>
               <w:spacing w:after="20"/>
             </w:pPr>
-            <w:r/>
             <w:r>
               <w:rPr>
                 <w:b w:val="0"/>
@@ -214,13 +205,12 @@
       <w:tr>
         <w:tc>
           <w:tcPr>
-            <w:tcW w:type="dxa" w:w="1984"/>
+            <w:tcW w:type="dxa" w:w="1871"/>
           </w:tcPr>
           <w:p>
             <w:pPr>
               <w:spacing w:after="20"/>
             </w:pPr>
-            <w:r/>
             <w:r>
               <w:rPr>
                 <w:b w:val="0"/>
@@ -231,13 +221,12 @@
         </w:tc>
         <w:tc>
           <w:tcPr>
-            <w:tcW w:type="dxa" w:w="3969"/>
+            <w:tcW w:type="dxa" w:w="4252"/>
           </w:tcPr>
           <w:p>
             <w:pPr>
               <w:spacing w:after="20"/>
             </w:pPr>
-            <w:r/>
             <w:r>
               <w:rPr>
                 <w:b w:val="0"/>
@@ -248,13 +237,12 @@
         </w:tc>
         <w:tc>
           <w:tcPr>
-            <w:tcW w:type="dxa" w:w="3685"/>
+            <w:tcW w:type="dxa" w:w="3515"/>
           </w:tcPr>
           <w:p>
             <w:pPr>
               <w:spacing w:after="20"/>
             </w:pPr>
-            <w:r/>
             <w:r>
               <w:rPr>
                 <w:b w:val="0"/>
@@ -267,13 +255,12 @@
       <w:tr>
         <w:tc>
           <w:tcPr>
-            <w:tcW w:type="dxa" w:w="1984"/>
+            <w:tcW w:type="dxa" w:w="1871"/>
           </w:tcPr>
           <w:p>
             <w:pPr>
               <w:spacing w:after="20"/>
             </w:pPr>
-            <w:r/>
             <w:r>
               <w:rPr>
                 <w:b w:val="0"/>
@@ -284,13 +271,12 @@
         </w:tc>
         <w:tc>
           <w:tcPr>
-            <w:tcW w:type="dxa" w:w="3969"/>
+            <w:tcW w:type="dxa" w:w="4252"/>
           </w:tcPr>
           <w:p>
             <w:pPr>
               <w:spacing w:after="20"/>
             </w:pPr>
-            <w:r/>
             <w:r>
               <w:rPr>
                 <w:b w:val="0"/>
@@ -301,13 +287,12 @@
         </w:tc>
         <w:tc>
           <w:tcPr>
-            <w:tcW w:type="dxa" w:w="3685"/>
+            <w:tcW w:type="dxa" w:w="3515"/>
           </w:tcPr>
           <w:p>
             <w:pPr>
               <w:spacing w:after="20"/>
             </w:pPr>
-            <w:r/>
             <w:r>
               <w:rPr>
                 <w:b w:val="0"/>
@@ -320,13 +305,12 @@
       <w:tr>
         <w:tc>
           <w:tcPr>
-            <w:tcW w:type="dxa" w:w="1984"/>
+            <w:tcW w:type="dxa" w:w="1871"/>
           </w:tcPr>
           <w:p>
             <w:pPr>
               <w:spacing w:after="20"/>
             </w:pPr>
-            <w:r/>
             <w:r>
               <w:rPr>
                 <w:b w:val="0"/>
@@ -337,13 +321,12 @@
         </w:tc>
         <w:tc>
           <w:tcPr>
-            <w:tcW w:type="dxa" w:w="3969"/>
+            <w:tcW w:type="dxa" w:w="4252"/>
           </w:tcPr>
           <w:p>
             <w:pPr>
               <w:spacing w:after="20"/>
             </w:pPr>
-            <w:r/>
             <w:r>
               <w:rPr>
                 <w:b w:val="0"/>
@@ -354,13 +337,12 @@
         </w:tc>
         <w:tc>
           <w:tcPr>
-            <w:tcW w:type="dxa" w:w="3685"/>
+            <w:tcW w:type="dxa" w:w="3515"/>
           </w:tcPr>
           <w:p>
             <w:pPr>
               <w:spacing w:after="20"/>
             </w:pPr>
-            <w:r/>
             <w:r>
               <w:rPr>
                 <w:b w:val="0"/>
@@ -373,13 +355,12 @@
       <w:tr>
         <w:tc>
           <w:tcPr>
-            <w:tcW w:type="dxa" w:w="1984"/>
+            <w:tcW w:type="dxa" w:w="1871"/>
           </w:tcPr>
           <w:p>
             <w:pPr>
               <w:spacing w:after="20"/>
             </w:pPr>
-            <w:r/>
             <w:r>
               <w:rPr>
                 <w:b w:val="0"/>
@@ -390,13 +371,12 @@
         </w:tc>
         <w:tc>
           <w:tcPr>
-            <w:tcW w:type="dxa" w:w="3969"/>
+            <w:tcW w:type="dxa" w:w="4252"/>
           </w:tcPr>
           <w:p>
             <w:pPr>
               <w:spacing w:after="20"/>
             </w:pPr>
-            <w:r/>
             <w:r>
               <w:rPr>
                 <w:b w:val="0"/>
@@ -407,13 +387,12 @@
         </w:tc>
         <w:tc>
           <w:tcPr>
-            <w:tcW w:type="dxa" w:w="3685"/>
+            <w:tcW w:type="dxa" w:w="3515"/>
           </w:tcPr>
           <w:p>
             <w:pPr>
               <w:spacing w:after="20"/>
             </w:pPr>
-            <w:r/>
             <w:r>
               <w:rPr>
                 <w:b w:val="0"/>
@@ -426,13 +405,12 @@
       <w:tr>
         <w:tc>
           <w:tcPr>
-            <w:tcW w:type="dxa" w:w="1984"/>
+            <w:tcW w:type="dxa" w:w="1871"/>
           </w:tcPr>
           <w:p>
             <w:pPr>
               <w:spacing w:after="20"/>
             </w:pPr>
-            <w:r/>
             <w:r>
               <w:rPr>
                 <w:b w:val="0"/>
@@ -443,13 +421,12 @@
         </w:tc>
         <w:tc>
           <w:tcPr>
-            <w:tcW w:type="dxa" w:w="3969"/>
+            <w:tcW w:type="dxa" w:w="4252"/>
           </w:tcPr>
           <w:p>
             <w:pPr>
               <w:spacing w:after="20"/>
             </w:pPr>
-            <w:r/>
             <w:r>
               <w:rPr>
                 <w:b w:val="0"/>
@@ -460,18 +437,17 @@
         </w:tc>
         <w:tc>
           <w:tcPr>
-            <w:tcW w:type="dxa" w:w="3685"/>
+            <w:tcW w:type="dxa" w:w="3515"/>
           </w:tcPr>
           <w:p>
             <w:pPr>
               <w:spacing w:after="20"/>
             </w:pPr>
-            <w:r/>
             <w:r>
               <w:rPr>
                 <w:b w:val="0"/>
               </w:rPr>
-              <w:t>e-PAN, GST, Certificate of Incorporation</w:t>
+              <w:t>e-PAN, GST, Certificate of Incorporation, Udyam</w:t>
             </w:r>
           </w:p>
         </w:tc>
@@ -479,13 +455,12 @@
       <w:tr>
         <w:tc>
           <w:tcPr>
-            <w:tcW w:type="dxa" w:w="1984"/>
+            <w:tcW w:type="dxa" w:w="1871"/>
           </w:tcPr>
           <w:p>
             <w:pPr>
               <w:spacing w:after="20"/>
             </w:pPr>
-            <w:r/>
             <w:r>
               <w:rPr>
                 <w:b w:val="0"/>
@@ -496,13 +471,12 @@
         </w:tc>
         <w:tc>
           <w:tcPr>
-            <w:tcW w:type="dxa" w:w="3969"/>
+            <w:tcW w:type="dxa" w:w="4252"/>
           </w:tcPr>
           <w:p>
             <w:pPr>
               <w:spacing w:after="20"/>
             </w:pPr>
-            <w:r/>
             <w:r>
               <w:rPr>
                 <w:b w:val="0"/>
@@ -513,18 +487,17 @@
         </w:tc>
         <w:tc>
           <w:tcPr>
-            <w:tcW w:type="dxa" w:w="3685"/>
+            <w:tcW w:type="dxa" w:w="3515"/>
           </w:tcPr>
           <w:p>
             <w:pPr>
               <w:spacing w:after="20"/>
             </w:pPr>
-            <w:r/>
             <w:r>
               <w:rPr>
                 <w:b w:val="0"/>
               </w:rPr>
-              <w:t>GST Annexure B (IMG_20210406_0003.pdf)</w:t>
+              <w:t>GST Annexure B (IMG_20210406_0003.pdf); signs the cancelled cheque as Director</w:t>
             </w:r>
           </w:p>
         </w:tc>
@@ -532,13 +505,12 @@
       <w:tr>
         <w:tc>
           <w:tcPr>
-            <w:tcW w:type="dxa" w:w="1984"/>
+            <w:tcW w:type="dxa" w:w="1871"/>
           </w:tcPr>
           <w:p>
             <w:pPr>
               <w:spacing w:after="20"/>
             </w:pPr>
-            <w:r/>
             <w:r>
               <w:rPr>
                 <w:b w:val="0"/>
@@ -549,35 +521,39 @@
         </w:tc>
         <w:tc>
           <w:tcPr>
-            <w:tcW w:type="dxa" w:w="3969"/>
+            <w:tcW w:type="dxa" w:w="4252"/>
           </w:tcPr>
           <w:p>
             <w:pPr>
               <w:spacing w:after="20"/>
             </w:pPr>
-            <w:r/>
             <w:r>
               <w:rPr>
                 <w:b w:val="0"/>
               </w:rPr>
-              <w:t>12024033000055 (State licence, Manufacturer – General Manufacturing)</w:t>
+              <w:t xml:space="preserve">12024033000055, State licence, Manufacturer – General Manufacturing. Renewed 22-01-2026, </w:t>
+            </w:r>
+            <w:r>
+              <w:rPr>
+                <w:b/>
+              </w:rPr>
+              <w:t>valid up to 02-02-2027</w:t>
             </w:r>
           </w:p>
         </w:tc>
         <w:tc>
           <w:tcPr>
-            <w:tcW w:type="dxa" w:w="3685"/>
+            <w:tcW w:type="dxa" w:w="3515"/>
           </w:tcPr>
           <w:p>
             <w:pPr>
               <w:spacing w:after="20"/>
             </w:pPr>
-            <w:r/>
             <w:r>
               <w:rPr>
                 <w:b w:val="0"/>
               </w:rPr>
-              <w:t>food license_240407_142643.pdf</w:t>
+              <w:t>FSSAI Licence - Renewed 2026-27.pdf</w:t>
             </w:r>
           </w:p>
         </w:tc>
@@ -585,52 +561,61 @@
       <w:tr>
         <w:tc>
           <w:tcPr>
-            <w:tcW w:type="dxa" w:w="1984"/>
+            <w:tcW w:type="dxa" w:w="1871"/>
           </w:tcPr>
           <w:p>
             <w:pPr>
               <w:spacing w:after="20"/>
             </w:pPr>
-            <w:r/>
             <w:r>
               <w:rPr>
                 <w:b w:val="0"/>
               </w:rPr>
-              <w:t>Company e-mail</w:t>
+              <w:t>MSME (Udyam)</w:t>
             </w:r>
           </w:p>
         </w:tc>
         <w:tc>
           <w:tcPr>
-            <w:tcW w:type="dxa" w:w="3969"/>
+            <w:tcW w:type="dxa" w:w="4252"/>
           </w:tcPr>
           <w:p>
             <w:pPr>
               <w:spacing w:after="20"/>
             </w:pPr>
-            <w:r/>
             <w:r>
               <w:rPr>
                 <w:b w:val="0"/>
               </w:rPr>
-              <w:t>info@joesjyotiservicespvt.ltd</w:t>
+              <w:t xml:space="preserve">UDYAM-OD-19-0057563, </w:t>
+            </w:r>
+            <w:r>
+              <w:rPr>
+                <w:b/>
+              </w:rPr>
+              <w:t>Micro</w:t>
+            </w:r>
+            <w:r>
+              <w:rPr>
+                <w:b w:val="0"/>
+              </w:rPr>
+              <w:t xml:space="preserve"> enterprise, Services (NIC 56303 – fruit juice bars), registered 27-10-2023</w:t>
             </w:r>
           </w:p>
         </w:tc>
         <w:tc>
           <w:tcPr>
-            <w:tcW w:type="dxa" w:w="3685"/>
+            <w:tcW w:type="dxa" w:w="3515"/>
           </w:tcPr>
           <w:p>
             <w:pPr>
               <w:spacing w:after="20"/>
             </w:pPr>
-            <w:r/>
             <w:r>
               <w:rPr>
                 <w:b w:val="0"/>
               </w:rPr>
-              <w:t>The address Mayfair wrote to</w:t>
+              <w:t>Udyam Registration Certificate.pdf</w:t>
             </w:r>
           </w:p>
         </w:tc>
@@ -638,10 +623,12 @@
       <w:tr>
         <w:tc>
           <w:tcPr>
-            <w:tcW w:type="dxa" w:w="1984"/>
+            <w:tcW w:type="dxa" w:w="1871"/>
           </w:tcPr>
           <w:p>
-            <w:r/>
+            <w:pPr>
+              <w:spacing w:after="20"/>
+            </w:pPr>
             <w:r>
               <w:rPr>
                 <w:b w:val="0"/>
@@ -652,10 +639,12 @@
         </w:tc>
         <w:tc>
           <w:tcPr>
-            <w:tcW w:type="dxa" w:w="3969"/>
+            <w:tcW w:type="dxa" w:w="4252"/>
           </w:tcPr>
           <w:p>
-            <w:r/>
+            <w:pPr>
+              <w:spacing w:after="20"/>
+            </w:pPr>
             <w:r>
               <w:rPr>
                 <w:b w:val="0"/>
@@ -666,10 +655,12 @@
         </w:tc>
         <w:tc>
           <w:tcPr>
-            <w:tcW w:type="dxa" w:w="3685"/>
+            <w:tcW w:type="dxa" w:w="3515"/>
           </w:tcPr>
           <w:p>
-            <w:r/>
+            <w:pPr>
+              <w:spacing w:after="20"/>
+            </w:pPr>
             <w:r>
               <w:rPr>
                 <w:b w:val="0"/>
@@ -682,10 +673,12 @@
       <w:tr>
         <w:tc>
           <w:tcPr>
-            <w:tcW w:type="dxa" w:w="1984"/>
+            <w:tcW w:type="dxa" w:w="1871"/>
           </w:tcPr>
           <w:p>
-            <w:r/>
+            <w:pPr>
+              <w:spacing w:after="20"/>
+            </w:pPr>
             <w:r>
               <w:rPr>
                 <w:b w:val="0"/>
@@ -696,10 +689,12 @@
         </w:tc>
         <w:tc>
           <w:tcPr>
-            <w:tcW w:type="dxa" w:w="3969"/>
+            <w:tcW w:type="dxa" w:w="4252"/>
           </w:tcPr>
           <w:p>
-            <w:r/>
+            <w:pPr>
+              <w:spacing w:after="20"/>
+            </w:pPr>
             <w:r>
               <w:rPr>
                 <w:b w:val="0"/>
@@ -710,15 +705,67 @@
         </w:tc>
         <w:tc>
           <w:tcPr>
-            <w:tcW w:type="dxa" w:w="3685"/>
+            <w:tcW w:type="dxa" w:w="3515"/>
           </w:tcPr>
           <w:p>
-            <w:r/>
+            <w:pPr>
+              <w:spacing w:after="20"/>
+            </w:pPr>
             <w:r>
               <w:rPr>
                 <w:b w:val="0"/>
               </w:rPr>
               <w:t>Cancelled cheque</w:t>
+            </w:r>
+          </w:p>
+        </w:tc>
+      </w:tr>
+      <w:tr>
+        <w:tc>
+          <w:tcPr>
+            <w:tcW w:type="dxa" w:w="1871"/>
+          </w:tcPr>
+          <w:p>
+            <w:pPr>
+              <w:spacing w:after="20"/>
+            </w:pPr>
+            <w:r>
+              <w:rPr>
+                <w:b w:val="0"/>
+              </w:rPr>
+              <w:t>Company e-mail</w:t>
+            </w:r>
+          </w:p>
+        </w:tc>
+        <w:tc>
+          <w:tcPr>
+            <w:tcW w:type="dxa" w:w="4252"/>
+          </w:tcPr>
+          <w:p>
+            <w:pPr>
+              <w:spacing w:after="20"/>
+            </w:pPr>
+            <w:r>
+              <w:rPr>
+                <w:b w:val="0"/>
+              </w:rPr>
+              <w:t>info@joesjyotiservicespvt.ltd</w:t>
+            </w:r>
+          </w:p>
+        </w:tc>
+        <w:tc>
+          <w:tcPr>
+            <w:tcW w:type="dxa" w:w="3515"/>
+          </w:tcPr>
+          <w:p>
+            <w:pPr>
+              <w:spacing w:after="20"/>
+            </w:pPr>
+            <w:r>
+              <w:rPr>
+                <w:b w:val="0"/>
+              </w:rPr>
+              <w:t>The address Mayfair wrote to</w:t>
             </w:r>
           </w:p>
         </w:tc>
@@ -758,7 +805,6 @@
             <w:pPr>
               <w:spacing w:after="20"/>
             </w:pPr>
-            <w:r/>
             <w:r>
               <w:rPr>
                 <w:b/>
@@ -777,7 +823,6 @@
             <w:pPr>
               <w:spacing w:after="20"/>
             </w:pPr>
-            <w:r/>
             <w:r>
               <w:rPr>
                 <w:b/>
@@ -796,7 +841,6 @@
             <w:pPr>
               <w:spacing w:after="20"/>
             </w:pPr>
-            <w:r/>
             <w:r>
               <w:rPr>
                 <w:b/>
@@ -815,7 +859,6 @@
             <w:pPr>
               <w:spacing w:after="20"/>
             </w:pPr>
-            <w:r/>
             <w:r>
               <w:rPr>
                 <w:b/>
@@ -835,7 +878,6 @@
             <w:pPr>
               <w:spacing w:after="20"/>
             </w:pPr>
-            <w:r/>
             <w:r>
               <w:rPr>
                 <w:b w:val="0"/>
@@ -852,7 +894,6 @@
             <w:pPr>
               <w:spacing w:after="20"/>
             </w:pPr>
-            <w:r/>
             <w:r>
               <w:rPr>
                 <w:b w:val="0"/>
@@ -866,18 +907,20 @@
             <w:tcW w:type="dxa" w:w="4422"/>
           </w:tcPr>
           <w:p>
-            <w:r/>
+            <w:pPr>
+              <w:spacing w:after="20"/>
+            </w:pPr>
             <w:r>
               <w:rPr>
                 <w:b w:val="0"/>
               </w:rPr>
-              <w:t xml:space="preserve">Filled in, including bank details from the cancelled cheque (Current Account ticked, based on the account code "CANOR" printed on the cheque). </w:t>
+              <w:t xml:space="preserve">Filled in, including bank details (Current Account ticked, based on the account code “CANOR” printed on the cheque) and MSME details. </w:t>
             </w:r>
             <w:r>
               <w:rPr>
                 <w:b/>
               </w:rPr>
-              <w:t>Phone, ESIC, MSME no., payment/delivery terms and E-invoice are still blank.</w:t>
+              <w:t>Phone, ESIC, payment/delivery terms and E-invoice are still blank.</w:t>
             </w:r>
           </w:p>
         </w:tc>
@@ -889,7 +932,6 @@
             <w:pPr>
               <w:spacing w:after="20"/>
             </w:pPr>
-            <w:r/>
             <w:r>
               <w:rPr>
                 <w:b w:val="0"/>
@@ -908,7 +950,6 @@
             <w:pPr>
               <w:spacing w:after="20"/>
             </w:pPr>
-            <w:r/>
             <w:r>
               <w:rPr>
                 <w:b w:val="0"/>
@@ -925,7 +966,6 @@
             <w:pPr>
               <w:spacing w:after="20"/>
             </w:pPr>
-            <w:r/>
             <w:r>
               <w:rPr>
                 <w:b w:val="0"/>
@@ -942,7 +982,6 @@
             <w:pPr>
               <w:spacing w:after="20"/>
             </w:pPr>
-            <w:r/>
             <w:r>
               <w:rPr>
                 <w:b w:val="0"/>
@@ -959,7 +998,6 @@
             <w:pPr>
               <w:spacing w:after="20"/>
             </w:pPr>
-            <w:r/>
             <w:r>
               <w:rPr>
                 <w:b w:val="0"/>
@@ -978,7 +1016,6 @@
             <w:pPr>
               <w:spacing w:after="20"/>
             </w:pPr>
-            <w:r/>
             <w:r>
               <w:rPr>
                 <w:b w:val="0"/>
@@ -995,7 +1032,6 @@
             <w:pPr>
               <w:spacing w:after="20"/>
             </w:pPr>
-            <w:r/>
             <w:r>
               <w:rPr>
                 <w:b w:val="0"/>
@@ -1009,21 +1045,26 @@
             <w:tcW w:type="dxa" w:w="4422"/>
           </w:tcPr>
           <w:p>
-            <w:r/>
+            <w:pPr>
+              <w:spacing w:after="20"/>
+            </w:pPr>
             <w:r>
               <w:rPr>
                 <w:b w:val="0"/>
               </w:rPr>
-              <w:t xml:space="preserve">Form filled as asked. </w:t>
+              <w:t xml:space="preserve">Registered. Send the GST certificate. The “not registered” declaration was filled in as asked, but </w:t>
             </w:r>
             <w:r>
               <w:rPr>
                 <w:b/>
               </w:rPr>
-              <w:t xml:space="preserve">⚠ Do not sign or send it while GSTIN 21AAECJ4555G1ZT is active. </w:t>
+              <w:t>⚠ do not sign or send it while GSTIN 21AAECJ4555G1ZT is active</w:t>
             </w:r>
             <w:r>
-              <w:t>It declares the company is not required to register for GST, which contradicts the GST certificate. Send the GST certificate instead, unless the registration has been cancelled.</w:t>
+              <w:rPr>
+                <w:b w:val="0"/>
+              </w:rPr>
+              <w:t>: it contradicts the GST certificate.</w:t>
             </w:r>
           </w:p>
         </w:tc>
@@ -1032,9 +1073,14 @@
             <w:tcW w:type="dxa" w:w="2835"/>
           </w:tcPr>
           <w:p>
-            <w:r/>
+            <w:pPr>
+              <w:spacing w:after="20"/>
+            </w:pPr>
             <w:r>
-              <w:t>IMG_20210406_0001.pdf (GST REG-06) + IMG_20210406_0003.pdf (Annexure B). Only if GST is cancelled: GST Declaration (Not Registered) - Joes Jyoti Services.docx</w:t>
+              <w:rPr>
+                <w:b w:val="0"/>
+              </w:rPr>
+              <w:t>IMG_20210406_0001.pdf (GST REG-06) + IMG_20210406_0003.pdf (Annexure B)</w:t>
             </w:r>
           </w:p>
         </w:tc>
@@ -1048,7 +1094,6 @@
             <w:pPr>
               <w:spacing w:after="20"/>
             </w:pPr>
-            <w:r/>
             <w:r>
               <w:rPr>
                 <w:b w:val="0"/>
@@ -1065,7 +1110,6 @@
             <w:pPr>
               <w:spacing w:after="20"/>
             </w:pPr>
-            <w:r/>
             <w:r>
               <w:rPr>
                 <w:b w:val="0"/>
@@ -1082,7 +1126,6 @@
             <w:pPr>
               <w:spacing w:after="20"/>
             </w:pPr>
-            <w:r/>
             <w:r>
               <w:rPr>
                 <w:b w:val="0"/>
@@ -1099,7 +1142,6 @@
             <w:pPr>
               <w:spacing w:after="20"/>
             </w:pPr>
-            <w:r/>
             <w:r>
               <w:rPr>
                 <w:b w:val="0"/>
@@ -1118,7 +1160,6 @@
             <w:pPr>
               <w:spacing w:after="20"/>
             </w:pPr>
-            <w:r/>
             <w:r>
               <w:rPr>
                 <w:b w:val="0"/>
@@ -1135,12 +1176,11 @@
             <w:pPr>
               <w:spacing w:after="20"/>
             </w:pPr>
-            <w:r/>
             <w:r>
               <w:rPr>
                 <w:b w:val="0"/>
               </w:rPr>
-              <w:t>MSME certificate / declaration</w:t>
+              <w:t>MSME certificate</w:t>
             </w:r>
           </w:p>
         </w:tc>
@@ -1152,30 +1192,17 @@
             <w:pPr>
               <w:spacing w:after="20"/>
             </w:pPr>
-            <w:r/>
             <w:r>
               <w:rPr>
                 <w:b/>
               </w:rPr>
-              <w:t>No MSME/Udyam certificate was found in the repo.</w:t>
+              <w:t>Registered (Micro).</w:t>
             </w:r>
             <w:r>
               <w:rPr>
                 <w:b w:val="0"/>
               </w:rPr>
-              <w:t xml:space="preserve"> A “not registered” declaration is filled in. Send it </w:t>
-            </w:r>
-            <w:r>
-              <w:rPr>
-                <w:b/>
-              </w:rPr>
-              <w:t>only if the company has no Udyam registration</w:t>
-            </w:r>
-            <w:r>
-              <w:rPr>
-                <w:b w:val="0"/>
-              </w:rPr>
-              <w:t>. If it does, send the Udyam certificate and enter the number in the form (rows 44 and 48).</w:t>
+              <w:t xml:space="preserve"> Send the Udyam certificate. The “not registered” declaration has been removed because it would be false.</w:t>
             </w:r>
           </w:p>
         </w:tc>
@@ -1187,12 +1214,11 @@
             <w:pPr>
               <w:spacing w:after="20"/>
             </w:pPr>
-            <w:r/>
             <w:r>
               <w:rPr>
                 <w:b w:val="0"/>
               </w:rPr>
-              <w:t>MSME Declaration (Not Registered) - Joes Jyoti Services.docx</w:t>
+              <w:t>Udyam Registration Certificate.pdf</w:t>
             </w:r>
           </w:p>
         </w:tc>
@@ -1206,7 +1232,6 @@
             <w:pPr>
               <w:spacing w:after="20"/>
             </w:pPr>
-            <w:r/>
             <w:r>
               <w:rPr>
                 <w:b w:val="0"/>
@@ -1223,7 +1248,6 @@
             <w:pPr>
               <w:spacing w:after="20"/>
             </w:pPr>
-            <w:r/>
             <w:r>
               <w:rPr>
                 <w:b w:val="0"/>
@@ -1240,18 +1264,17 @@
             <w:pPr>
               <w:spacing w:after="20"/>
             </w:pPr>
-            <w:r/>
             <w:r>
               <w:rPr>
                 <w:b/>
               </w:rPr>
-              <w:t>⚠ The licence in the repo expired on 02-02-2025.</w:t>
+              <w:t>Valid.</w:t>
             </w:r>
             <w:r>
               <w:rPr>
                 <w:b w:val="0"/>
               </w:rPr>
-              <w:t xml:space="preserve"> Get the renewed licence from FoSCoS and send that instead.</w:t>
+              <w:t xml:space="preserve"> Renewed 22-01-2026, valid up to 02-02-2027. The file is a photo of page 1 only (no annexures).</w:t>
             </w:r>
           </w:p>
         </w:tc>
@@ -1263,12 +1286,11 @@
             <w:pPr>
               <w:spacing w:after="20"/>
             </w:pPr>
-            <w:r/>
             <w:r>
               <w:rPr>
                 <w:b w:val="0"/>
               </w:rPr>
-              <w:t>food license_240407_142643.pdf (expired copy)</w:t>
+              <w:t>FSSAI Licence - Renewed 2026-27.pdf</w:t>
             </w:r>
           </w:p>
         </w:tc>
@@ -1282,7 +1304,6 @@
             <w:pPr>
               <w:spacing w:after="20"/>
             </w:pPr>
-            <w:r/>
             <w:r>
               <w:rPr>
                 <w:b w:val="0"/>
@@ -1299,7 +1320,6 @@
             <w:pPr>
               <w:spacing w:after="20"/>
             </w:pPr>
-            <w:r/>
             <w:r>
               <w:rPr>
                 <w:b w:val="0"/>
@@ -1313,7 +1333,9 @@
             <w:tcW w:type="dxa" w:w="4422"/>
           </w:tcPr>
           <w:p>
-            <w:r/>
+            <w:pPr>
+              <w:spacing w:after="20"/>
+            </w:pPr>
             <w:r>
               <w:rPr>
                 <w:b w:val="0"/>
@@ -1327,7 +1349,9 @@
             <w:tcW w:type="dxa" w:w="2835"/>
           </w:tcPr>
           <w:p>
-            <w:r/>
+            <w:pPr>
+              <w:spacing w:after="20"/>
+            </w:pPr>
             <w:r>
               <w:rPr>
                 <w:b w:val="0"/>
@@ -1346,7 +1370,6 @@
             <w:pPr>
               <w:spacing w:after="20"/>
             </w:pPr>
-            <w:r/>
             <w:r>
               <w:rPr>
                 <w:b w:val="0"/>
@@ -1363,7 +1386,6 @@
             <w:pPr>
               <w:spacing w:after="20"/>
             </w:pPr>
-            <w:r/>
             <w:r>
               <w:rPr>
                 <w:b w:val="0"/>
@@ -1380,7 +1402,6 @@
             <w:pPr>
               <w:spacing w:after="20"/>
             </w:pPr>
-            <w:r/>
             <w:r>
               <w:rPr>
                 <w:b w:val="0"/>
@@ -1409,7 +1430,6 @@
             <w:pPr>
               <w:spacing w:after="20"/>
             </w:pPr>
-            <w:r/>
             <w:r>
               <w:rPr>
                 <w:b w:val="0"/>
@@ -1428,7 +1448,6 @@
             <w:pPr>
               <w:spacing w:after="20"/>
             </w:pPr>
-            <w:r/>
             <w:r>
               <w:rPr>
                 <w:b w:val="0"/>
@@ -1445,7 +1464,6 @@
             <w:pPr>
               <w:spacing w:after="20"/>
             </w:pPr>
-            <w:r/>
             <w:r>
               <w:rPr>
                 <w:b w:val="0"/>
@@ -1462,7 +1480,6 @@
             <w:pPr>
               <w:spacing w:after="20"/>
             </w:pPr>
-            <w:r/>
             <w:r>
               <w:rPr>
                 <w:b w:val="0"/>
@@ -1479,7 +1496,6 @@
             <w:pPr>
               <w:spacing w:after="20"/>
             </w:pPr>
-            <w:r/>
             <w:r>
               <w:rPr>
                 <w:b w:val="0"/>
@@ -1496,41 +1512,7 @@
         <w:pStyle w:val="Heading2"/>
       </w:pPr>
       <w:r>
-        <w:t>Still needed from the company before sending</w:t>
-      </w:r>
-    </w:p>
-    <w:p>
-      <w:pPr>
-        <w:pStyle w:val="ListNumber"/>
-      </w:pPr>
-      <w:r>
-        <w:rPr>
-          <w:b/>
-        </w:rPr>
-        <w:t>Renewed FSSAI licence.</w:t>
-      </w:r>
-      <w:r>
-        <w:rPr>
-          <w:b w:val="0"/>
-        </w:rPr>
-        <w:t xml:space="preserve"> The copy on file was valid only until 02-02-2025. Also, the licensed premises (MIG-II, 7/2, Housing Board Colony, Chandrasekharpur, 751016) differ from the registered office. Check that the renewal covers the premises you will supply from.</w:t>
-      </w:r>
-    </w:p>
-    <w:p>
-      <w:pPr>
-        <w:pStyle w:val="ListNumber"/>
-      </w:pPr>
-      <w:r>
-        <w:rPr>
-          <w:b/>
-        </w:rPr>
-        <w:t>MSME / Udyam status:</w:t>
-      </w:r>
-      <w:r>
-        <w:rPr>
-          <w:b w:val="0"/>
-        </w:rPr>
-        <w:t xml:space="preserve"> registered (send the certificate and number) or not registered (send the declaration).</w:t>
+        <w:t>Still needed before sending</w:t>
       </w:r>
     </w:p>
     <w:p>
@@ -1564,7 +1546,31 @@
         <w:rPr>
           <w:b w:val="0"/>
         </w:rPr>
-        <w:t xml:space="preserve"> for the form (row 15). None is on the company documents. The FSSAI licence lists Esther Digal’s mobile as 8763464919 (as of 2024); use it only if it is still current.</w:t>
+        <w:t xml:space="preserve"> for the form (row 15). The documents show two different mobiles: </w:t>
+      </w:r>
+      <w:r>
+        <w:rPr>
+          <w:b/>
+        </w:rPr>
+        <w:t>8280914586</w:t>
+      </w:r>
+      <w:r>
+        <w:rPr>
+          <w:b w:val="0"/>
+        </w:rPr>
+        <w:t xml:space="preserve"> (Udyam, 2023) and </w:t>
+      </w:r>
+      <w:r>
+        <w:rPr>
+          <w:b/>
+        </w:rPr>
+        <w:t>8763464919</w:t>
+      </w:r>
+      <w:r>
+        <w:rPr>
+          <w:b w:val="0"/>
+        </w:rPr>
+        <w:t xml:space="preserve"> (Esther Digal, FSSAI 2024). Confirm which one is current.</w:t>
       </w:r>
     </w:p>
     <w:p>
@@ -1609,9 +1615,70 @@
         <w:rPr>
           <w:b/>
         </w:rPr>
+        <w:t>Udyam certificate check.</w:t>
+      </w:r>
+      <w:r>
+        <w:rPr>
+          <w:b w:val="0"/>
+        </w:rPr>
+        <w:t xml:space="preserve"> The print is dated 27-10-2023 and shows only the 2023-24 classification. It also gives the date of incorporation as </w:t>
+      </w:r>
+      <w:r>
+        <w:rPr>
+          <w:b/>
+        </w:rPr>
+        <w:t>29/07/2019</w:t>
+      </w:r>
+      <w:r>
+        <w:rPr>
+          <w:b w:val="0"/>
+        </w:rPr>
+        <w:t xml:space="preserve">, whereas the Certificate of Incorporation says </w:t>
+      </w:r>
+      <w:r>
+        <w:rPr>
+          <w:b/>
+        </w:rPr>
+        <w:t>29-01-2019</w:t>
+      </w:r>
+      <w:r>
+        <w:rPr>
+          <w:b w:val="0"/>
+        </w:rPr>
+        <w:t>. Consider downloading a fresh print from udyamregistration.gov.in and correcting the date on the portal if it is wrong.</w:t>
+      </w:r>
+    </w:p>
+    <w:p>
+      <w:pPr>
+        <w:pStyle w:val="ListNumber"/>
+      </w:pPr>
+      <w:r>
+        <w:rPr>
+          <w:b/>
+        </w:rPr>
+        <w:t>FSSAI licensed premises</w:t>
+      </w:r>
+      <w:r>
+        <w:rPr>
+          <w:b w:val="0"/>
+        </w:rPr>
+        <w:t xml:space="preserve"> are MIG-II, 7/2, Housing Board Colony, Chandrasekharpur – 751016, not the registered office. Make sure that is where you supply Mayfair from.</w:t>
+      </w:r>
+    </w:p>
+    <w:p>
+      <w:pPr>
+        <w:pStyle w:val="ListNumber"/>
+      </w:pPr>
+      <w:r>
+        <w:rPr>
+          <w:b/>
+        </w:rPr>
         <w:t>Confirm the signatory.</w:t>
       </w:r>
       <w:r>
+        <w:rPr>
+          <w:b w:val="0"/>
+        </w:rPr>
         <w:t xml:space="preserve"> All declarations name </w:t>
       </w:r>
       <w:r>
@@ -1621,6 +1688,9 @@
         <w:t>Esther Digal, Director</w:t>
       </w:r>
       <w:r>
+        <w:rPr>
+          <w:b w:val="0"/>
+        </w:rPr>
         <w:t>. She is the only director on the GST record and signs the cancelled cheque as Director. Change this if someone else signs.</w:t>
       </w:r>
     </w:p>
@@ -1632,7 +1702,7 @@
         <w:rPr>
           <w:b w:val="0"/>
         </w:rPr>
-        <w:t xml:space="preserve">Print the 206AB, MSME and PAN–Aadhaar declarations </w:t>
+        <w:t xml:space="preserve">Print the 206AB and PAN–Aadhaar declarations </w:t>
       </w:r>
       <w:r>
         <w:rPr>
@@ -1644,7 +1714,7 @@
         <w:rPr>
           <w:b w:val="0"/>
         </w:rPr>
-        <w:t>, then sign and stamp them. Sign and stamp the vendor form too. All declarations are dated 30-09-2026; change the date if they are signed later.</w:t>
+        <w:t>, then sign and stamp them. Sign and stamp the vendor form too. Declarations are dated 30-09-2026; change the date if they are signed later.</w:t>
       </w:r>
     </w:p>
     <w:p>
@@ -1652,7 +1722,7 @@
         <w:pStyle w:val="Heading2"/>
       </w:pPr>
       <w:r>
-        <w:t>Draft reply e-mail (send once the items above are done)</w:t>
+        <w:t>Draft reply e-mail (send once items 1–8 are done)</w:t>
       </w:r>
     </w:p>
     <w:p>
@@ -1755,7 +1825,7 @@
         <w:spacing w:after="20"/>
       </w:pPr>
       <w:r>
-        <w:t>MSME: [Udyam Registration Certificate / Self-declaration of non-registration]</w:t>
+        <w:t>Udyam (MSME) Registration Certificate – UDYAM-OD-19-0057563 (Micro)</w:t>
       </w:r>
     </w:p>
     <w:p>
@@ -1764,7 +1834,7 @@
         <w:spacing w:after="20"/>
       </w:pPr>
       <w:r>
-        <w:t>FSSAI Licence – No. 12024033000055</w:t>
+        <w:t>FSSAI Licence – No. 12024033000055 (valid up to 02-02-2027)</w:t>
       </w:r>
     </w:p>
     <w:p>
@@ -1773,7 +1843,7 @@
         <w:spacing w:after="20"/>
       </w:pPr>
       <w:r>
-        <w:t>Cancelled cheque</w:t>
+        <w:t>Cancelled cheque – Axis Bank</w:t>
       </w:r>
     </w:p>
     <w:p>

</xml_diff>